<commit_message>
feat(rprofile): v12.11 TrueNAS home quota visible in status(), biome_quota() and ttyd
</commit_message>
<xml_diff>
--- a/docs/wiki/ops-guide.docx
+++ b/docs/wiki/ops-guide.docx
@@ -23,7 +23,7 @@
         <w:pStyle w:val="Date"/>
       </w:pPr>
       <w:r>
-        <w:t xml:space="preserve">Generated 2026-10-07 from git 065466e — do not edit this file, edit the Markdown in docs/</w:t>
+        <w:t xml:space="preserve">Generated 2026-10-08 from git 743a942 — do not edit this file, edit the Markdown in docs/</w:t>
       </w:r>
     </w:p>
     <w:p>
@@ -3592,7 +3592,7 @@
           <w:b/>
           <w:bCs/>
         </w:rPr>
-        <w:t xml:space="preserve">12.10</w:t>
+        <w:t xml:space="preserve">12.11</w:t>
       </w:r>
       <w:r>
         <w:t xml:space="preserve">.</w:t>
@@ -4211,7 +4211,7 @@
         <w:t xml:space="preserve"> </w:t>
       </w:r>
       <w:r>
-        <w:t xml:space="preserve">v27 instead of T1's v12.10 fragments and audit v28. Other active T2 differences</w:t>
+        <w:t xml:space="preserve">v27 instead of T1's v12.11 fragments and audit v28. Other active T2 differences</w:t>
       </w:r>
       <w:r>
         <w:t xml:space="preserve"> </w:t>
@@ -7300,7 +7300,7 @@
         <w:t xml:space="preserve"> </w:t>
       </w:r>
       <w:r>
-        <w:t xml:space="preserve">weight 200. Ollama uses CPU weight 80. Rprofile 12.10 adds cgroup-aware core</w:t>
+        <w:t xml:space="preserve">weight 200. Ollama uses CPU weight 80. Rprofile 12.11 adds cgroup-aware core</w:t>
       </w:r>
       <w:r>
         <w:t xml:space="preserve"> </w:t>
@@ -8479,7 +8479,7 @@
         <w:pStyle w:val="FirstParagraph"/>
       </w:pPr>
       <w:r>
-        <w:t xml:space="preserve">Rprofile version 12.10 is deployed as a dispatcher plus these active</w:t>
+        <w:t xml:space="preserve">Rprofile version 12.11 is deployed as a dispatcher plus these active</w:t>
       </w:r>
       <w:r>
         <w:t xml:space="preserve"> </w:t>
@@ -11252,7 +11252,7 @@
         <w:rPr>
           <w:rStyle w:val="VerbatimChar"/>
         </w:rPr>
-        <w:t xml:space="preserve">RPROFILE_VERSION="12.10"</w:t>
+        <w:t xml:space="preserve">RPROFILE_VERSION="12.11"</w:t>
       </w:r>
       <w:r>
         <w:t xml:space="preserve">;</w:t>
@@ -13674,7 +13674,7 @@
         <w:rPr>
           <w:rStyle w:val="VerbatimChar"/>
         </w:rPr>
-        <w:t xml:space="preserve">12.10</w:t>
+        <w:t xml:space="preserve">12.11</w:t>
       </w:r>
       <w:r>
         <w:t xml:space="preserve">.</w:t>
@@ -14715,8 +14715,8 @@
     <w:bookmarkEnd w:id="91"/>
     <w:bookmarkEnd w:id="92"/>
     <w:bookmarkEnd w:id="93"/>
-    <w:bookmarkStart w:id="102" w:name="operations__user_quotas_and_resourcesmd"/>
-    <w:bookmarkStart w:id="101" w:name="Xe77e1f34fb470dd33b7a099f2517125c53b21ab"/>
+    <w:bookmarkStart w:id="103" w:name="operations__user_quotas_and_resourcesmd"/>
+    <w:bookmarkStart w:id="102" w:name="Xe77e1f34fb470dd33b7a099f2517125c53b21ab"/>
     <w:p>
       <w:pPr>
         <w:pStyle w:val="Heading1"/>
@@ -16597,7 +16597,7 @@
       </w:r>
     </w:p>
     <w:bookmarkEnd w:id="98"/>
-    <w:bookmarkStart w:id="99" w:name="Xc5cbbb995789632c6405402673388d73779f45d"/>
+    <w:bookmarkStart w:id="100" w:name="Xc5cbbb995789632c6405402673388d73779f45d"/>
     <w:p>
       <w:pPr>
         <w:pStyle w:val="Heading2"/>
@@ -16834,8 +16834,375 @@
         <w:t xml:space="preserve">by numeric UID. Keep the Troubleshooting §4.4 anchor unchanged when linking it.</w:t>
       </w:r>
     </w:p>
+    <w:bookmarkStart w:id="99" w:name="Xe43125091e345bed02f05ed7c1e0e4149e1528d"/>
+    <w:p>
+      <w:pPr>
+        <w:pStyle w:val="Heading3"/>
+      </w:pPr>
+      <w:r>
+        <w:t xml:space="preserve">Optional user-visible quota cache (Rprofile v12.11)</w:t>
+      </w:r>
+    </w:p>
+    <w:p>
+      <w:pPr>
+        <w:pStyle w:val="FirstParagraph"/>
+      </w:pPr>
+      <w:r>
+        <w:rPr>
+          <w:rStyle w:val="VerbatimChar"/>
+        </w:rPr>
+        <w:t xml:space="preserve">ENABLE_HOME_QUOTA_VIEW=true</w:t>
+      </w:r>
+      <w:r>
+        <w:t xml:space="preserve"> </w:t>
+      </w:r>
+      <w:r>
+        <w:t xml:space="preserve">deploys step 11g: a root cron fetches the exact</w:t>
+      </w:r>
+      <w:r>
+        <w:t xml:space="preserve"> </w:t>
+      </w:r>
+      <w:r>
+        <w:t xml:space="preserve">read-only</w:t>
+      </w:r>
+      <w:r>
+        <w:t xml:space="preserve"> </w:t>
+      </w:r>
+      <w:r>
+        <w:rPr>
+          <w:rStyle w:val="VerbatimChar"/>
+        </w:rPr>
+        <w:t xml:space="preserve">zfs userspace</w:t>
+      </w:r>
+      <w:r>
+        <w:t xml:space="preserve"> </w:t>
+      </w:r>
+      <w:r>
+        <w:t xml:space="preserve">output over a restricted SSH key every five minutes</w:t>
+      </w:r>
+      <w:r>
+        <w:t xml:space="preserve"> </w:t>
+      </w:r>
+      <w:r>
+        <w:t xml:space="preserve">and writes local cache files under</w:t>
+      </w:r>
+      <w:r>
+        <w:t xml:space="preserve"> </w:t>
+      </w:r>
+      <w:r>
+        <w:rPr>
+          <w:rStyle w:val="VerbatimChar"/>
+        </w:rPr>
+        <w:t xml:space="preserve">/var/lib/biome-quota</w:t>
+      </w:r>
+      <w:r>
+        <w:t xml:space="preserve"> </w:t>
+      </w:r>
+      <w:r>
+        <w:t xml:space="preserve">(0711). Each</w:t>
+      </w:r>
+      <w:r>
+        <w:t xml:space="preserve"> </w:t>
+      </w:r>
+      <w:r>
+        <w:rPr>
+          <w:rStyle w:val="VerbatimChar"/>
+        </w:rPr>
+        <w:t xml:space="preserve">&lt;uid&gt;</w:t>
+      </w:r>
+      <w:r>
+        <w:t xml:space="preserve"> </w:t>
+      </w:r>
+      <w:r>
+        <w:t xml:space="preserve">file is 0400 and owned by that uid; users cannot list or read one another's</w:t>
+      </w:r>
+      <w:r>
+        <w:t xml:space="preserve"> </w:t>
+      </w:r>
+      <w:r>
+        <w:t xml:space="preserve">files. The cache is local ext4, not NFS, so NFS ACL inheritance and a full user</w:t>
+      </w:r>
+      <w:r>
+        <w:t xml:space="preserve"> </w:t>
+      </w:r>
+      <w:r>
+        <w:t xml:space="preserve">quota cannot block the update.</w:t>
+      </w:r>
+    </w:p>
+    <w:p>
+      <w:pPr>
+        <w:pStyle w:val="BodyText"/>
+      </w:pPr>
+      <w:r>
+        <w:t xml:space="preserve">User surfaces:</w:t>
+      </w:r>
+      <w:r>
+        <w:t xml:space="preserve"> </w:t>
+      </w:r>
+      <w:r>
+        <w:rPr>
+          <w:rStyle w:val="VerbatimChar"/>
+        </w:rPr>
+        <w:t xml:space="preserve">status()</w:t>
+      </w:r>
+      <w:r>
+        <w:t xml:space="preserve"> </w:t>
+      </w:r>
+      <w:r>
+        <w:t xml:space="preserve">(</w:t>
+      </w:r>
+      <w:r>
+        <w:rPr>
+          <w:rStyle w:val="VerbatimChar"/>
+        </w:rPr>
+        <w:t xml:space="preserve">Home (~)</w:t>
+      </w:r>
+      <w:r>
+        <w:t xml:space="preserve"> </w:t>
+      </w:r>
+      <w:r>
+        <w:t xml:space="preserve">line),</w:t>
+      </w:r>
+      <w:r>
+        <w:t xml:space="preserve"> </w:t>
+      </w:r>
+      <w:r>
+        <w:rPr>
+          <w:rStyle w:val="VerbatimChar"/>
+        </w:rPr>
+        <w:t xml:space="preserve">biome_quota()</w:t>
+      </w:r>
+      <w:r>
+        <w:t xml:space="preserve"> </w:t>
+      </w:r>
+      <w:r>
+        <w:t xml:space="preserve">in R,</w:t>
+      </w:r>
+      <w:r>
+        <w:t xml:space="preserve"> </w:t>
+      </w:r>
+      <w:r>
+        <w:rPr>
+          <w:rStyle w:val="VerbatimChar"/>
+        </w:rPr>
+        <w:t xml:space="preserve">biome-quota</w:t>
+      </w:r>
+      <w:r>
+        <w:t xml:space="preserve"> </w:t>
+      </w:r>
+      <w:r>
+        <w:t xml:space="preserve">in ttyd and a login warning at</w:t>
+      </w:r>
+      <w:r>
+        <w:t xml:space="preserve"> </w:t>
+      </w:r>
+      <w:r>
+        <w:rPr>
+          <w:rStyle w:val="VerbatimChar"/>
+        </w:rPr>
+        <w:t xml:space="preserve">QUOTA_WARN_PCT</w:t>
+      </w:r>
+      <w:r>
+        <w:t xml:space="preserve"> </w:t>
+      </w:r>
+      <w:r>
+        <w:t xml:space="preserve">(90% default).</w:t>
+      </w:r>
+      <w:r>
+        <w:t xml:space="preserve"> </w:t>
+      </w:r>
+      <w:r>
+        <w:t xml:space="preserve">T2 mounts the same host cache read-only. Setup and TrueNAS least-privilege</w:t>
+      </w:r>
+      <w:r>
+        <w:t xml:space="preserve"> </w:t>
+      </w:r>
+      <w:r>
+        <w:t xml:space="preserve">steps are in</w:t>
+      </w:r>
+      <w:r>
+        <w:t xml:space="preserve"> </w:t>
+      </w:r>
+      <w:r>
+        <w:rPr>
+          <w:rStyle w:val="VerbatimChar"/>
+        </w:rPr>
+        <w:t xml:space="preserve">plan/home_quota_visibility/implementation_plan.md</w:t>
+      </w:r>
+      <w:r>
+        <w:t xml:space="preserve">.</w:t>
+      </w:r>
+    </w:p>
+    <w:p>
+      <w:pPr>
+        <w:pStyle w:val="SourceCode"/>
+      </w:pPr>
+      <w:r>
+        <w:rPr>
+          <w:rStyle w:val="FunctionTok"/>
+        </w:rPr>
+        <w:t xml:space="preserve">sudo</w:t>
+      </w:r>
+      <w:r>
+        <w:rPr>
+          <w:rStyle w:val="NormalTok"/>
+        </w:rPr>
+        <w:t xml:space="preserve"> bash scripts/50_setup_nodes.sh     </w:t>
+      </w:r>
+      <w:r>
+        <w:rPr>
+          <w:rStyle w:val="CommentTok"/>
+        </w:rPr>
+        <w:t xml:space="preserve"># option QH, or full deploy</w:t>
+      </w:r>
+      <w:r>
+        <w:br/>
+      </w:r>
+      <w:r>
+        <w:rPr>
+          <w:rStyle w:val="FunctionTok"/>
+        </w:rPr>
+        <w:t xml:space="preserve">sudo</w:t>
+      </w:r>
+      <w:r>
+        <w:rPr>
+          <w:rStyle w:val="NormalTok"/>
+        </w:rPr>
+        <w:t xml:space="preserve"> </w:t>
+      </w:r>
+      <w:r>
+        <w:rPr>
+          <w:rStyle w:val="AttributeTok"/>
+        </w:rPr>
+        <w:t xml:space="preserve">-u</w:t>
+      </w:r>
+      <w:r>
+        <w:rPr>
+          <w:rStyle w:val="NormalTok"/>
+        </w:rPr>
+        <w:t xml:space="preserve"> </w:t>
+      </w:r>
+      <w:r>
+        <w:rPr>
+          <w:rStyle w:val="OperatorTok"/>
+        </w:rPr>
+        <w:t xml:space="preserve">&lt;</w:t>
+      </w:r>
+      <w:r>
+        <w:rPr>
+          <w:rStyle w:val="NormalTok"/>
+        </w:rPr>
+        <w:t xml:space="preserve">user</w:t>
+      </w:r>
+      <w:r>
+        <w:rPr>
+          <w:rStyle w:val="OperatorTok"/>
+        </w:rPr>
+        <w:t xml:space="preserve">&gt;</w:t>
+      </w:r>
+      <w:r>
+        <w:rPr>
+          <w:rStyle w:val="NormalTok"/>
+        </w:rPr>
+        <w:t xml:space="preserve"> biome-quota</w:t>
+      </w:r>
+      <w:r>
+        <w:br/>
+      </w:r>
+      <w:r>
+        <w:rPr>
+          <w:rStyle w:val="FunctionTok"/>
+        </w:rPr>
+        <w:t xml:space="preserve">sudo</w:t>
+      </w:r>
+      <w:r>
+        <w:rPr>
+          <w:rStyle w:val="NormalTok"/>
+        </w:rPr>
+        <w:t xml:space="preserve"> stat </w:t>
+      </w:r>
+      <w:r>
+        <w:rPr>
+          <w:rStyle w:val="AttributeTok"/>
+        </w:rPr>
+        <w:t xml:space="preserve">-c</w:t>
+      </w:r>
+      <w:r>
+        <w:rPr>
+          <w:rStyle w:val="NormalTok"/>
+        </w:rPr>
+        <w:t xml:space="preserve"> </w:t>
+      </w:r>
+      <w:r>
+        <w:rPr>
+          <w:rStyle w:val="StringTok"/>
+        </w:rPr>
+        <w:t xml:space="preserve">'%U %G %a %n'</w:t>
+      </w:r>
+      <w:r>
+        <w:rPr>
+          <w:rStyle w:val="NormalTok"/>
+        </w:rPr>
+        <w:t xml:space="preserve"> /var/lib/biome-quota/</w:t>
+      </w:r>
+      <w:r>
+        <w:rPr>
+          <w:rStyle w:val="VariableTok"/>
+        </w:rPr>
+        <w:t xml:space="preserve">$(</w:t>
+      </w:r>
+      <w:r>
+        <w:rPr>
+          <w:rStyle w:val="FunctionTok"/>
+        </w:rPr>
+        <w:t xml:space="preserve">id</w:t>
+      </w:r>
+      <w:r>
+        <w:rPr>
+          <w:rStyle w:val="NormalTok"/>
+        </w:rPr>
+        <w:t xml:space="preserve"> </w:t>
+      </w:r>
+      <w:r>
+        <w:rPr>
+          <w:rStyle w:val="AttributeTok"/>
+        </w:rPr>
+        <w:t xml:space="preserve">-u</w:t>
+      </w:r>
+      <w:r>
+        <w:rPr>
+          <w:rStyle w:val="NormalTok"/>
+        </w:rPr>
+        <w:t xml:space="preserve"> </w:t>
+      </w:r>
+      <w:r>
+        <w:rPr>
+          <w:rStyle w:val="OperatorTok"/>
+        </w:rPr>
+        <w:t xml:space="preserve">&lt;</w:t>
+      </w:r>
+      <w:r>
+        <w:rPr>
+          <w:rStyle w:val="NormalTok"/>
+        </w:rPr>
+        <w:t xml:space="preserve">user</w:t>
+      </w:r>
+      <w:r>
+        <w:rPr>
+          <w:rStyle w:val="OperatorTok"/>
+        </w:rPr>
+        <w:t xml:space="preserve">&gt;</w:t>
+      </w:r>
+      <w:r>
+        <w:rPr>
+          <w:rStyle w:val="VariableTok"/>
+        </w:rPr>
+        <w:t xml:space="preserve">)</w:t>
+      </w:r>
+    </w:p>
     <w:bookmarkEnd w:id="99"/>
-    <w:bookmarkStart w:id="100" w:name="X31beec6c111558ed89715654a5ed71b472cb56b"/>
+    <w:bookmarkEnd w:id="100"/>
+    <w:bookmarkStart w:id="101" w:name="X31beec6c111558ed89715654a5ed71b472cb56b"/>
     <w:p>
       <w:pPr>
         <w:pStyle w:val="Heading2"/>
@@ -17010,11 +17377,11 @@
         <w:t xml:space="preserve">docs/operations/USER_QUOTAS_AND_RESOURCES.md</w:t>
       </w:r>
     </w:p>
-    <w:bookmarkEnd w:id="100"/>
     <w:bookmarkEnd w:id="101"/>
     <w:bookmarkEnd w:id="102"/>
-    <w:bookmarkStart w:id="110" w:name="operations__add_storage_no_rebootmd"/>
-    <w:bookmarkStart w:id="109" w:name="X0a0f62055ae4489aef468fc6f5779f64fb8d6c5"/>
+    <w:bookmarkEnd w:id="103"/>
+    <w:bookmarkStart w:id="111" w:name="operations__add_storage_no_rebootmd"/>
+    <w:bookmarkStart w:id="110" w:name="X0a0f62055ae4489aef468fc6f5779f64fb8d6c5"/>
     <w:p>
       <w:pPr>
         <w:pStyle w:val="Heading1"/>
@@ -17073,7 +17440,7 @@
         <w:t xml:space="preserve">.</w:t>
       </w:r>
     </w:p>
-    <w:bookmarkStart w:id="103" w:name="Xdea0fdb6c866c5299520afaebef8cf8e5073692"/>
+    <w:bookmarkStart w:id="104" w:name="Xdea0fdb6c866c5299520afaebef8cf8e5073692"/>
     <w:p>
       <w:pPr>
         <w:pStyle w:val="Heading2"/>
@@ -17447,8 +17814,8 @@
         <w:t xml:space="preserve">is the newly attached, unused disk.</w:t>
       </w:r>
     </w:p>
-    <w:bookmarkEnd w:id="103"/>
-    <w:bookmarkStart w:id="104" w:name="X6fac7c8dd176ad8a949f38b84dbbc8c77c536b4"/>
+    <w:bookmarkEnd w:id="104"/>
+    <w:bookmarkStart w:id="105" w:name="X6fac7c8dd176ad8a949f38b84dbbc8c77c536b4"/>
     <w:p>
       <w:pPr>
         <w:pStyle w:val="Heading2"/>
@@ -17713,8 +18080,8 @@
         <w:t xml:space="preserve">).</w:t>
       </w:r>
     </w:p>
-    <w:bookmarkEnd w:id="104"/>
-    <w:bookmarkStart w:id="105" w:name="Xf5f6ff486953bfbb796cd9ca40093e0e293a499"/>
+    <w:bookmarkEnd w:id="105"/>
+    <w:bookmarkStart w:id="106" w:name="Xf5f6ff486953bfbb796cd9ca40093e0e293a499"/>
     <w:p>
       <w:pPr>
         <w:pStyle w:val="Heading2"/>
@@ -17952,8 +18319,8 @@
         <w:t xml:space="preserve">.</w:t>
       </w:r>
     </w:p>
-    <w:bookmarkEnd w:id="105"/>
-    <w:bookmarkStart w:id="106" w:name="Xcae073466876871bc9e0ccad0a702ec15201da2"/>
+    <w:bookmarkEnd w:id="106"/>
+    <w:bookmarkStart w:id="107" w:name="Xcae073466876871bc9e0ccad0a702ec15201da2"/>
     <w:p>
       <w:pPr>
         <w:pStyle w:val="Heading2"/>
@@ -18280,8 +18647,8 @@
         <w:t xml:space="preserve">'f=$(mktemp /Rtmp/rtmp-check.XXXXXX); printf ok &gt;"$f"; rm -f "$f"'</w:t>
       </w:r>
     </w:p>
-    <w:bookmarkEnd w:id="106"/>
-    <w:bookmarkStart w:id="107" w:name="Xebf24f33856320fe1e99b19200901bdc64047c2"/>
+    <w:bookmarkEnd w:id="107"/>
+    <w:bookmarkStart w:id="108" w:name="Xebf24f33856320fe1e99b19200901bdc64047c2"/>
     <w:p>
       <w:pPr>
         <w:pStyle w:val="Heading2"/>
@@ -18428,8 +18795,8 @@
         <w:t xml:space="preserve">; schedule a controlled restart only if they must be terminated and recreated.</w:t>
       </w:r>
     </w:p>
-    <w:bookmarkEnd w:id="107"/>
-    <w:bookmarkStart w:id="108" w:name="Xa4bfdb7e96b236d54f6201f1d14b393b194d3ec"/>
+    <w:bookmarkEnd w:id="108"/>
+    <w:bookmarkStart w:id="109" w:name="Xa4bfdb7e96b236d54f6201f1d14b393b194d3ec"/>
     <w:p>
       <w:pPr>
         <w:pStyle w:val="Heading2"/>
@@ -18820,11 +19187,11 @@
         <w:t xml:space="preserve">docs/operations/add_storage_no_reboot.md</w:t>
       </w:r>
     </w:p>
-    <w:bookmarkEnd w:id="108"/>
     <w:bookmarkEnd w:id="109"/>
     <w:bookmarkEnd w:id="110"/>
-    <w:bookmarkStart w:id="135" w:name="operations__rstudio_session_isolationmd"/>
-    <w:bookmarkStart w:id="134" w:name="X1b9deb4328bc8671b0978924b3d578f4ccace96"/>
+    <w:bookmarkEnd w:id="111"/>
+    <w:bookmarkStart w:id="136" w:name="operations__rstudio_session_isolationmd"/>
+    <w:bookmarkStart w:id="135" w:name="X1b9deb4328bc8671b0978924b3d578f4ccace96"/>
     <w:p>
       <w:pPr>
         <w:pStyle w:val="Heading1"/>
@@ -18906,7 +19273,7 @@
         </w:pict>
       </w:r>
     </w:p>
-    <w:bookmarkStart w:id="111" w:name="Xbd1975c53ba1f865e060265dac32139387ef6e2"/>
+    <w:bookmarkStart w:id="112" w:name="Xbd1975c53ba1f865e060265dac32139387ef6e2"/>
     <w:p>
       <w:pPr>
         <w:pStyle w:val="Heading2"/>
@@ -18999,8 +19366,8 @@
         </w:pict>
       </w:r>
     </w:p>
-    <w:bookmarkEnd w:id="111"/>
-    <w:bookmarkStart w:id="116" w:name="Xdf3f7910a6f5234fbec3b0356ce75c6802ed039"/>
+    <w:bookmarkEnd w:id="112"/>
+    <w:bookmarkStart w:id="117" w:name="Xdf3f7910a6f5234fbec3b0356ce75c6802ed039"/>
     <w:p>
       <w:pPr>
         <w:pStyle w:val="Heading2"/>
@@ -19009,7 +19376,7 @@
         <w:t xml:space="preserve">1. The Limitation</w:t>
       </w:r>
     </w:p>
-    <w:bookmarkStart w:id="112" w:name="Xe0cb29ae33ab63c3aa59732300185cab49fb3e7"/>
+    <w:bookmarkStart w:id="113" w:name="Xe0cb29ae33ab63c3aa59732300185cab49fb3e7"/>
     <w:p>
       <w:pPr>
         <w:pStyle w:val="Heading3"/>
@@ -19119,8 +19486,8 @@
         <w:t xml:space="preserve">process rather than spawning a new one.</w:t>
       </w:r>
     </w:p>
-    <w:bookmarkEnd w:id="112"/>
-    <w:bookmarkStart w:id="113" w:name="Xe21a507fa6cf9d019825d78157ac3cb1f35dfc7"/>
+    <w:bookmarkEnd w:id="113"/>
+    <w:bookmarkStart w:id="114" w:name="Xe21a507fa6cf9d019825d78157ac3cb1f35dfc7"/>
     <w:p>
       <w:pPr>
         <w:pStyle w:val="Heading3"/>
@@ -19295,8 +19662,8 @@
         <w:t xml:space="preserve">configuration option, which does not exist in OSS.</w:t>
       </w:r>
     </w:p>
-    <w:bookmarkEnd w:id="113"/>
-    <w:bookmarkStart w:id="115" w:name="Xcffc4cb82a50d7d8367a946a21ca7886e6f5fb2"/>
+    <w:bookmarkEnd w:id="114"/>
+    <w:bookmarkStart w:id="116" w:name="Xcffc4cb82a50d7d8367a946a21ca7886e6f5fb2"/>
     <w:p>
       <w:pPr>
         <w:pStyle w:val="Heading3"/>
@@ -19351,7 +19718,7 @@
       <w:r>
         <w:t xml:space="preserve"> </w:t>
       </w:r>
-      <w:hyperlink r:id="rId114">
+      <w:hyperlink r:id="rId115">
         <w:r>
           <w:rPr>
             <w:rStyle w:val="Hyperlink"/>
@@ -19367,9 +19734,9 @@
         </w:pict>
       </w:r>
     </w:p>
-    <w:bookmarkEnd w:id="115"/>
     <w:bookmarkEnd w:id="116"/>
-    <w:bookmarkStart w:id="121" w:name="Xfcab8bbc5f0547404d84026d0bbf7c304080f48"/>
+    <w:bookmarkEnd w:id="117"/>
+    <w:bookmarkStart w:id="122" w:name="Xfcab8bbc5f0547404d84026d0bbf7c304080f48"/>
     <w:p>
       <w:pPr>
         <w:pStyle w:val="Heading2"/>
@@ -19378,7 +19745,7 @@
         <w:t xml:space="preserve">2. Investigation History</w:t>
       </w:r>
     </w:p>
-    <w:bookmarkStart w:id="117" w:name="X02f5cfb5481a83af19de69163803af93a2f53f5"/>
+    <w:bookmarkStart w:id="118" w:name="X02f5cfb5481a83af19de69163803af93a2f53f5"/>
     <w:p>
       <w:pPr>
         <w:pStyle w:val="Heading3"/>
@@ -19841,8 +20208,8 @@
         </w:tc>
       </w:tr>
     </w:tbl>
-    <w:bookmarkEnd w:id="117"/>
-    <w:bookmarkStart w:id="119" w:name="X74bb544fa1127148aeee0470cd4f46ef2f7e609"/>
+    <w:bookmarkEnd w:id="118"/>
+    <w:bookmarkStart w:id="120" w:name="X74bb544fa1127148aeee0470cd4f46ef2f7e609"/>
     <w:p>
       <w:pPr>
         <w:pStyle w:val="Heading3"/>
@@ -19958,7 +20325,7 @@
       <w:r>
         <w:t xml:space="preserve"> </w:t>
       </w:r>
-      <w:hyperlink r:id="rId118">
+      <w:hyperlink r:id="rId119">
         <w:r>
           <w:rPr>
             <w:rStyle w:val="Hyperlink"/>
@@ -19970,8 +20337,8 @@
         <w:t xml:space="preserve">).</w:t>
       </w:r>
     </w:p>
-    <w:bookmarkEnd w:id="119"/>
-    <w:bookmarkStart w:id="120" w:name="Xf2bb40a37d78cf262374eac2739f47ef5ca6507"/>
+    <w:bookmarkEnd w:id="120"/>
+    <w:bookmarkStart w:id="121" w:name="Xf2bb40a37d78cf262374eac2739f47ef5ca6507"/>
     <w:p>
       <w:pPr>
         <w:pStyle w:val="Heading3"/>
@@ -20018,9 +20385,9 @@
         </w:pict>
       </w:r>
     </w:p>
-    <w:bookmarkEnd w:id="120"/>
     <w:bookmarkEnd w:id="121"/>
-    <w:bookmarkStart w:id="125" w:name="Xa165d9ab4447140233d64e2191c04401033ebc6"/>
+    <w:bookmarkEnd w:id="122"/>
+    <w:bookmarkStart w:id="126" w:name="Xa165d9ab4447140233d64e2191c04401033ebc6"/>
     <w:p>
       <w:pPr>
         <w:pStyle w:val="Heading2"/>
@@ -20029,7 +20396,7 @@
         <w:t xml:space="preserve">3. What the Multi-Node Architecture IS Designed For</w:t>
       </w:r>
     </w:p>
-    <w:bookmarkStart w:id="122" w:name="X7a86fd3292cacc48972cfc5afb4b77e6c6298e6"/>
+    <w:bookmarkStart w:id="123" w:name="X7a86fd3292cacc48972cfc5afb4b77e6c6298e6"/>
     <w:p>
       <w:pPr>
         <w:pStyle w:val="Heading3"/>
@@ -20120,8 +20487,8 @@
         <w:t xml:space="preserve">Each user gets one active RStudio session on one node. The load balancer (Nginx portal) distributes users across nodes based on availability.</w:t>
       </w:r>
     </w:p>
-    <w:bookmarkEnd w:id="122"/>
-    <w:bookmarkStart w:id="123" w:name="X30ae7b6d8b72d06253ef5970a99227e12453660"/>
+    <w:bookmarkEnd w:id="123"/>
+    <w:bookmarkStart w:id="124" w:name="X30ae7b6d8b72d06253ef5970a99227e12453660"/>
     <w:p>
       <w:pPr>
         <w:pStyle w:val="Heading3"/>
@@ -20208,8 +20575,8 @@
         <w:t xml:space="preserve">) are consistent across nodes.</w:t>
       </w:r>
     </w:p>
-    <w:bookmarkEnd w:id="123"/>
-    <w:bookmarkStart w:id="124" w:name="X5715bf78ad307d1ae0b3e812a97fe5ac354900f"/>
+    <w:bookmarkEnd w:id="124"/>
+    <w:bookmarkStart w:id="125" w:name="X5715bf78ad307d1ae0b3e812a97fe5ac354900f"/>
     <w:p>
       <w:pPr>
         <w:pStyle w:val="Heading3"/>
@@ -20261,9 +20628,9 @@
         </w:pict>
       </w:r>
     </w:p>
-    <w:bookmarkEnd w:id="124"/>
     <w:bookmarkEnd w:id="125"/>
-    <w:bookmarkStart w:id="128" w:name="Xc5b82c946219e9b2ac8a750f1f9e509a603d919"/>
+    <w:bookmarkEnd w:id="126"/>
+    <w:bookmarkStart w:id="129" w:name="Xc5b82c946219e9b2ac8a750f1f9e509a603d919"/>
     <w:p>
       <w:pPr>
         <w:pStyle w:val="Heading2"/>
@@ -20272,7 +20639,7 @@
         <w:t xml:space="preserve">4. Alternatives and Workarounds</w:t>
       </w:r>
     </w:p>
-    <w:bookmarkStart w:id="126" w:name="X715172aeb7cd87b43637ce48499b71d6e97340b"/>
+    <w:bookmarkStart w:id="127" w:name="X715172aeb7cd87b43637ce48499b71d6e97340b"/>
     <w:p>
       <w:pPr>
         <w:pStyle w:val="Heading3"/>
@@ -20585,8 +20952,8 @@
         </w:tc>
       </w:tr>
     </w:tbl>
-    <w:bookmarkEnd w:id="126"/>
-    <w:bookmarkStart w:id="127" w:name="X4433dfcd41502248fa6d78c0ce7d5745e41354e"/>
+    <w:bookmarkEnd w:id="127"/>
+    <w:bookmarkStart w:id="128" w:name="X4433dfcd41502248fa6d78c0ce7d5745e41354e"/>
     <w:p>
       <w:pPr>
         <w:pStyle w:val="Heading3"/>
@@ -20706,9 +21073,9 @@
         </w:pict>
       </w:r>
     </w:p>
-    <w:bookmarkEnd w:id="127"/>
     <w:bookmarkEnd w:id="128"/>
-    <w:bookmarkStart w:id="132" w:name="Xe5b8f3a7188c6d7acd86774c7e495c0db3e7317"/>
+    <w:bookmarkEnd w:id="129"/>
+    <w:bookmarkStart w:id="133" w:name="Xe5b8f3a7188c6d7acd86774c7e495c0db3e7317"/>
     <w:p>
       <w:pPr>
         <w:pStyle w:val="Heading2"/>
@@ -20725,7 +21092,7 @@
           <w:numId w:val="1032"/>
         </w:numPr>
       </w:pPr>
-      <w:hyperlink r:id="rId114">
+      <w:hyperlink r:id="rId115">
         <w:r>
           <w:rPr>
             <w:rStyle w:val="Hyperlink"/>
@@ -20742,7 +21109,7 @@
           <w:numId w:val="1032"/>
         </w:numPr>
       </w:pPr>
-      <w:hyperlink r:id="rId118">
+      <w:hyperlink r:id="rId119">
         <w:r>
           <w:rPr>
             <w:rStyle w:val="Hyperlink"/>
@@ -20759,7 +21126,7 @@
           <w:numId w:val="1032"/>
         </w:numPr>
       </w:pPr>
-      <w:hyperlink r:id="rId129">
+      <w:hyperlink r:id="rId130">
         <w:r>
           <w:rPr>
             <w:rStyle w:val="Hyperlink"/>
@@ -20776,7 +21143,7 @@
           <w:numId w:val="1032"/>
         </w:numPr>
       </w:pPr>
-      <w:hyperlink r:id="rId130">
+      <w:hyperlink r:id="rId131">
         <w:r>
           <w:rPr>
             <w:rStyle w:val="Hyperlink"/>
@@ -20793,7 +21160,7 @@
           <w:numId w:val="1032"/>
         </w:numPr>
       </w:pPr>
-      <w:hyperlink r:id="rId131">
+      <w:hyperlink r:id="rId132">
         <w:r>
           <w:rPr>
             <w:rStyle w:val="Hyperlink"/>
@@ -20809,8 +21176,8 @@
         </w:pict>
       </w:r>
     </w:p>
-    <w:bookmarkEnd w:id="132"/>
-    <w:bookmarkStart w:id="133" w:name="Xf9dda80cd39ed34d3a261d69ff10d041c5fd519"/>
+    <w:bookmarkEnd w:id="133"/>
+    <w:bookmarkStart w:id="134" w:name="Xf9dda80cd39ed34d3a261d69ff10d041c5fd519"/>
     <w:p>
       <w:pPr>
         <w:pStyle w:val="Heading2"/>
@@ -20938,11 +21305,11 @@
         <w:t xml:space="preserve">docs/operations/rstudio_session_isolation.md</w:t>
       </w:r>
     </w:p>
-    <w:bookmarkEnd w:id="133"/>
     <w:bookmarkEnd w:id="134"/>
     <w:bookmarkEnd w:id="135"/>
-    <w:bookmarkStart w:id="153" w:name="user_guides__server_native_apimd"/>
-    <w:bookmarkStart w:id="152" w:name="Xc3d23c73c245ca95e8f5f141aadd14ce4d88dc1"/>
+    <w:bookmarkEnd w:id="136"/>
+    <w:bookmarkStart w:id="154" w:name="user_guides__server_native_apimd"/>
+    <w:bookmarkStart w:id="153" w:name="Xc3d23c73c245ca95e8f5f141aadd14ce4d88dc1"/>
     <w:p>
       <w:pPr>
         <w:pStyle w:val="Heading1"/>
@@ -21081,7 +21448,7 @@
         </w:pict>
       </w:r>
     </w:p>
-    <w:bookmarkStart w:id="136" w:name="Xcb8505614a8b32544d9e2809ec9b743fa1e002f"/>
+    <w:bookmarkStart w:id="137" w:name="Xcb8505614a8b32544d9e2809ec9b743fa1e002f"/>
     <w:p>
       <w:pPr>
         <w:pStyle w:val="Heading2"/>
@@ -21169,8 +21536,8 @@
         </w:pict>
       </w:r>
     </w:p>
-    <w:bookmarkEnd w:id="136"/>
-    <w:bookmarkStart w:id="138" w:name="X22c75299b29d81957cf61571407e109d86564d0"/>
+    <w:bookmarkEnd w:id="137"/>
+    <w:bookmarkStart w:id="139" w:name="X22c75299b29d81957cf61571407e109d86564d0"/>
     <w:p>
       <w:pPr>
         <w:pStyle w:val="Heading2"/>
@@ -21179,7 +21546,7 @@
         <w:t xml:space="preserve">Cluster-building helpers</w:t>
       </w:r>
     </w:p>
-    <w:bookmarkStart w:id="137" w:name="X44641108d314edb95dec007de1585af9ace10d0"/>
+    <w:bookmarkStart w:id="138" w:name="X44641108d314edb95dec007de1585af9ace10d0"/>
     <w:p>
       <w:pPr>
         <w:pStyle w:val="Heading3"/>
@@ -21551,9 +21918,9 @@
         </w:pict>
       </w:r>
     </w:p>
-    <w:bookmarkEnd w:id="137"/>
     <w:bookmarkEnd w:id="138"/>
-    <w:bookmarkStart w:id="141" w:name="Xe7098c834a0f65be71d7972fec59caffd6478e6"/>
+    <w:bookmarkEnd w:id="139"/>
+    <w:bookmarkStart w:id="142" w:name="Xe7098c834a0f65be71d7972fec59caffd6478e6"/>
     <w:p>
       <w:pPr>
         <w:pStyle w:val="Heading2"/>
@@ -21907,7 +22274,7 @@
         <w:t xml:space="preserve">.</w:t>
       </w:r>
     </w:p>
-    <w:bookmarkStart w:id="139" w:name="Xcd2efebaaadcae26da42a2797816080f98ed903"/>
+    <w:bookmarkStart w:id="140" w:name="Xcd2efebaaadcae26da42a2797816080f98ed903"/>
     <w:p>
       <w:pPr>
         <w:pStyle w:val="Heading3"/>
@@ -22009,8 +22376,8 @@
         <w:t xml:space="preserve">while raised.</w:t>
       </w:r>
     </w:p>
-    <w:bookmarkEnd w:id="139"/>
-    <w:bookmarkStart w:id="140" w:name="X1817dda96fea593c9a3f7926af74980cd3aac58"/>
+    <w:bookmarkEnd w:id="140"/>
+    <w:bookmarkStart w:id="141" w:name="X1817dda96fea593c9a3f7926af74980cd3aac58"/>
     <w:p>
       <w:pPr>
         <w:pStyle w:val="Heading3"/>
@@ -22205,9 +22572,9 @@
         </w:pict>
       </w:r>
     </w:p>
-    <w:bookmarkEnd w:id="140"/>
     <w:bookmarkEnd w:id="141"/>
-    <w:bookmarkStart w:id="147" w:name="X3015e97241e7cbb6f6384dcd8e19fa671af5dd6"/>
+    <w:bookmarkEnd w:id="142"/>
+    <w:bookmarkStart w:id="148" w:name="X3015e97241e7cbb6f6384dcd8e19fa671af5dd6"/>
     <w:p>
       <w:pPr>
         <w:pStyle w:val="Heading2"/>
@@ -22216,7 +22583,7 @@
         <w:t xml:space="preserve">Forensic helpers</w:t>
       </w:r>
     </w:p>
-    <w:bookmarkStart w:id="142" w:name="X07aa1d93e49bdcaa5c28fbd44cf4af02a805d9d"/>
+    <w:bookmarkStart w:id="143" w:name="X07aa1d93e49bdcaa5c28fbd44cf4af02a805d9d"/>
     <w:p>
       <w:pPr>
         <w:pStyle w:val="Heading3"/>
@@ -22263,8 +22630,8 @@
         <w:t xml:space="preserve">is wedged.</w:t>
       </w:r>
     </w:p>
-    <w:bookmarkEnd w:id="142"/>
-    <w:bookmarkStart w:id="143" w:name="X2c98e9e9346261e1d3e8cd7b12a7c7d45a6d1a1"/>
+    <w:bookmarkEnd w:id="143"/>
+    <w:bookmarkStart w:id="144" w:name="X2c98e9e9346261e1d3e8cd7b12a7c7d45a6d1a1"/>
     <w:p>
       <w:pPr>
         <w:pStyle w:val="Heading3"/>
@@ -22320,8 +22687,8 @@
         <w:t xml:space="preserve">/ matrix-size ceilings.</w:t>
       </w:r>
     </w:p>
-    <w:bookmarkEnd w:id="143"/>
-    <w:bookmarkStart w:id="144" w:name="X02f0f928c703a2808a0ef7d9bba861fba8db6a4"/>
+    <w:bookmarkEnd w:id="144"/>
+    <w:bookmarkStart w:id="145" w:name="X02f0f928c703a2808a0ef7d9bba861fba8db6a4"/>
     <w:p>
       <w:pPr>
         <w:pStyle w:val="Heading3"/>
@@ -22371,8 +22738,8 @@
         <w:t xml:space="preserve">was set in the shell before starting R.</w:t>
       </w:r>
     </w:p>
-    <w:bookmarkEnd w:id="144"/>
-    <w:bookmarkStart w:id="145" w:name="Xbb2cfe364219b31a3553361a159dd596157d32d"/>
+    <w:bookmarkEnd w:id="145"/>
+    <w:bookmarkStart w:id="146" w:name="Xbb2cfe364219b31a3553361a159dd596157d32d"/>
     <w:p>
       <w:pPr>
         <w:pStyle w:val="Heading3"/>
@@ -22422,8 +22789,8 @@
         <w:t xml:space="preserve">instead of the user's NFS home.</w:t>
       </w:r>
     </w:p>
-    <w:bookmarkEnd w:id="145"/>
-    <w:bookmarkStart w:id="146" w:name="X4a24a3c48cd029fa015eb59b3200aa9c35b7e39"/>
+    <w:bookmarkEnd w:id="146"/>
+    <w:bookmarkStart w:id="147" w:name="X4a24a3c48cd029fa015eb59b3200aa9c35b7e39"/>
     <w:p>
       <w:pPr>
         <w:pStyle w:val="Heading3"/>
@@ -22456,9 +22823,9 @@
         </w:pict>
       </w:r>
     </w:p>
-    <w:bookmarkEnd w:id="146"/>
     <w:bookmarkEnd w:id="147"/>
-    <w:bookmarkStart w:id="148" w:name="Xde6be88d0c7c86ef276d073053f89d1ca2b14b5"/>
+    <w:bookmarkEnd w:id="148"/>
+    <w:bookmarkStart w:id="149" w:name="Xde6be88d0c7c86ef276d073053f89d1ca2b14b5"/>
     <w:p>
       <w:pPr>
         <w:pStyle w:val="Heading2"/>
@@ -22741,8 +23108,8 @@
         </w:pict>
       </w:r>
     </w:p>
-    <w:bookmarkEnd w:id="148"/>
-    <w:bookmarkStart w:id="149" w:name="X413cf15b6df6ff169f71302fbb1601433a6d178"/>
+    <w:bookmarkEnd w:id="149"/>
+    <w:bookmarkStart w:id="150" w:name="X413cf15b6df6ff169f71302fbb1601433a6d178"/>
     <w:p>
       <w:pPr>
         <w:pStyle w:val="Heading2"/>
@@ -23007,8 +23374,8 @@
         </w:pict>
       </w:r>
     </w:p>
-    <w:bookmarkEnd w:id="149"/>
-    <w:bookmarkStart w:id="150" w:name="X4e2c7fbd578e94ed3f383f7b9caa8c330c4ef22"/>
+    <w:bookmarkEnd w:id="150"/>
+    <w:bookmarkStart w:id="151" w:name="X4e2c7fbd578e94ed3f383f7b9caa8c330c4ef22"/>
     <w:p>
       <w:pPr>
         <w:pStyle w:val="Heading2"/>
@@ -23391,8 +23758,8 @@
         </w:pict>
       </w:r>
     </w:p>
-    <w:bookmarkEnd w:id="150"/>
-    <w:bookmarkStart w:id="151" w:name="Xd873a9918e8587f14582e804b933d989773a774"/>
+    <w:bookmarkEnd w:id="151"/>
+    <w:bookmarkStart w:id="152" w:name="Xd873a9918e8587f14582e804b933d989773a774"/>
     <w:p>
       <w:pPr>
         <w:pStyle w:val="Heading2"/>
@@ -23475,11 +23842,11 @@
         <w:t xml:space="preserve">docs/user_guides/SERVER_NATIVE_API.md</w:t>
       </w:r>
     </w:p>
-    <w:bookmarkEnd w:id="151"/>
     <w:bookmarkEnd w:id="152"/>
     <w:bookmarkEnd w:id="153"/>
-    <w:bookmarkStart w:id="171" w:name="reference__script_catalogmd"/>
-    <w:bookmarkStart w:id="170" w:name="X195c17528178b891fc9d9a71cc1a3847eb75bc0"/>
+    <w:bookmarkEnd w:id="154"/>
+    <w:bookmarkStart w:id="172" w:name="reference__script_catalogmd"/>
+    <w:bookmarkStart w:id="171" w:name="X195c17528178b891fc9d9a71cc1a3847eb75bc0"/>
     <w:p>
       <w:pPr>
         <w:pStyle w:val="Heading1"/>
@@ -23656,7 +24023,7 @@
         </w:pict>
       </w:r>
     </w:p>
-    <w:bookmarkStart w:id="154" w:name="Xcbc9af4070c543da1e9808acf96b40f169f08b1"/>
+    <w:bookmarkStart w:id="155" w:name="Xcbc9af4070c543da1e9808acf96b40f169f08b1"/>
     <w:p>
       <w:pPr>
         <w:pStyle w:val="Heading2"/>
@@ -24059,8 +24426,8 @@
         </w:pict>
       </w:r>
     </w:p>
-    <w:bookmarkEnd w:id="154"/>
-    <w:bookmarkStart w:id="155" w:name="Xbda42ff42c659d10d3897a29110c12f4b9acd60"/>
+    <w:bookmarkEnd w:id="155"/>
+    <w:bookmarkStart w:id="156" w:name="Xbda42ff42c659d10d3897a29110c12f4b9acd60"/>
     <w:p>
       <w:pPr>
         <w:pStyle w:val="Heading2"/>
@@ -24269,8 +24636,8 @@
         </w:pict>
       </w:r>
     </w:p>
-    <w:bookmarkEnd w:id="155"/>
-    <w:bookmarkStart w:id="161" w:name="Xe2cb1241b43643f847b23ed2d0116816c291d80"/>
+    <w:bookmarkEnd w:id="156"/>
+    <w:bookmarkStart w:id="162" w:name="Xe2cb1241b43643f847b23ed2d0116816c291d80"/>
     <w:p>
       <w:pPr>
         <w:pStyle w:val="Heading2"/>
@@ -24368,7 +24735,7 @@
         <w:t xml:space="preserve">.</w:t>
       </w:r>
     </w:p>
-    <w:bookmarkStart w:id="156" w:name="Xe09ba15c233659424b10e004aa0de5f9ad8898f"/>
+    <w:bookmarkStart w:id="157" w:name="Xe09ba15c233659424b10e004aa0de5f9ad8898f"/>
     <w:p>
       <w:pPr>
         <w:pStyle w:val="Heading3"/>
@@ -24603,8 +24970,8 @@
         </w:tc>
       </w:tr>
     </w:tbl>
-    <w:bookmarkEnd w:id="156"/>
-    <w:bookmarkStart w:id="157" w:name="Xb19d29a91cc81c51233bae48618b25c203853ce"/>
+    <w:bookmarkEnd w:id="157"/>
+    <w:bookmarkStart w:id="158" w:name="Xb19d29a91cc81c51233bae48618b25c203853ce"/>
     <w:p>
       <w:pPr>
         <w:pStyle w:val="Heading3"/>
@@ -25071,8 +25438,8 @@
         </w:tc>
       </w:tr>
     </w:tbl>
-    <w:bookmarkEnd w:id="157"/>
-    <w:bookmarkStart w:id="158" w:name="X6263ee78217a935dd119ab6eba0facec4d7cf14"/>
+    <w:bookmarkEnd w:id="158"/>
+    <w:bookmarkStart w:id="159" w:name="X6263ee78217a935dd119ab6eba0facec4d7cf14"/>
     <w:p>
       <w:pPr>
         <w:pStyle w:val="Heading3"/>
@@ -25558,8 +25925,8 @@
         </w:tc>
       </w:tr>
     </w:tbl>
-    <w:bookmarkEnd w:id="158"/>
-    <w:bookmarkStart w:id="159" w:name="X4843f6a74c21d407f4a16bca78ca09287358efd"/>
+    <w:bookmarkEnd w:id="159"/>
+    <w:bookmarkStart w:id="160" w:name="X4843f6a74c21d407f4a16bca78ca09287358efd"/>
     <w:p>
       <w:pPr>
         <w:pStyle w:val="Heading3"/>
@@ -26059,8 +26426,8 @@
         </w:tc>
       </w:tr>
     </w:tbl>
-    <w:bookmarkEnd w:id="159"/>
-    <w:bookmarkStart w:id="160" w:name="Xe7699f20c26b17f681d9562fcda07265ad4b7dd"/>
+    <w:bookmarkEnd w:id="160"/>
+    <w:bookmarkStart w:id="161" w:name="Xe7699f20c26b17f681d9562fcda07265ad4b7dd"/>
     <w:p>
       <w:pPr>
         <w:pStyle w:val="Heading3"/>
@@ -26272,13 +26639,13 @@
                 <w:b/>
                 <w:bCs/>
               </w:rPr>
-              <w:t xml:space="preserve">Authoritative node provisioner.</w:t>
-            </w:r>
-            <w:r>
-              <w:t xml:space="preserve"> </w:t>
-            </w:r>
-            <w:r>
-              <w:t xml:space="preserve">Idempotent steps with interactive menu and</w:t>
+              <w:t xml:space="preserve">Authoritative node provisioner</w:t>
+            </w:r>
+            <w:r>
+              <w:t xml:space="preserve"> </w:t>
+            </w:r>
+            <w:r>
+              <w:t xml:space="preserve">(includes optional step 11g home-quota view). Idempotent steps with interactive menu and</w:t>
             </w:r>
             <w:r>
               <w:t xml:space="preserve"> </w:t>
@@ -26761,9 +27128,9 @@
         </w:pict>
       </w:r>
     </w:p>
-    <w:bookmarkEnd w:id="160"/>
     <w:bookmarkEnd w:id="161"/>
-    <w:bookmarkStart w:id="162" w:name="X6437ee80ed846f426be3149b7ce003172e912f6"/>
+    <w:bookmarkEnd w:id="162"/>
+    <w:bookmarkStart w:id="163" w:name="X6437ee80ed846f426be3149b7ce003172e912f6"/>
     <w:p>
       <w:pPr>
         <w:pStyle w:val="Heading2"/>
@@ -27589,7 +27956,7 @@
               <w:jc w:val="left"/>
             </w:pPr>
             <w:r>
-              <w:t xml:space="preserve">v1.4.0. Aggregates logs, system state, integration tests.</w:t>
+              <w:t xml:space="preserve">v1.5.0. Aggregates logs, system state, integration tests.</w:t>
             </w:r>
             <w:r>
               <w:t xml:space="preserve"> </w:t>
@@ -27777,8 +28144,8 @@
         </w:pict>
       </w:r>
     </w:p>
-    <w:bookmarkEnd w:id="162"/>
-    <w:bookmarkStart w:id="163" w:name="X8bdd9fa790e22757364c7964d5ff56caed27f21"/>
+    <w:bookmarkEnd w:id="163"/>
+    <w:bookmarkStart w:id="164" w:name="X8bdd9fa790e22757364c7964d5ff56caed27f21"/>
     <w:p>
       <w:pPr>
         <w:pStyle w:val="Heading2"/>
@@ -27978,6 +28345,106 @@
               <w:rPr>
                 <w:rStyle w:val="VerbatimChar"/>
               </w:rPr>
+              <w:t xml:space="preserve">biome_quota_collect.sh.template</w:t>
+            </w:r>
+          </w:p>
+        </w:tc>
+        <w:tc>
+          <w:tcPr/>
+          <w:p>
+            <w:pPr>
+              <w:pStyle w:val="Compact"/>
+              <w:jc w:val="left"/>
+            </w:pPr>
+            <w:r>
+              <w:rPr>
+                <w:rStyle w:val="VerbatimChar"/>
+              </w:rPr>
+              <w:t xml:space="preserve">${BIOME_CONF}/script/biome_quota_collect.sh</w:t>
+            </w:r>
+          </w:p>
+        </w:tc>
+        <w:tc>
+          <w:tcPr/>
+          <w:p>
+            <w:pPr>
+              <w:pStyle w:val="Compact"/>
+              <w:jc w:val="left"/>
+            </w:pPr>
+            <w:r>
+              <w:t xml:space="preserve">Step 11g root cron collector: restricted SSH read from TrueNAS</w:t>
+            </w:r>
+            <w:r>
+              <w:t xml:space="preserve"> </w:t>
+            </w:r>
+            <w:r>
+              <w:rPr>
+                <w:rStyle w:val="VerbatimChar"/>
+              </w:rPr>
+              <w:t xml:space="preserve">zfs userspace</w:t>
+            </w:r>
+            <w:r>
+              <w:t xml:space="preserve">, validates and atomically refreshes private local per-uid cache files.</w:t>
+            </w:r>
+          </w:p>
+        </w:tc>
+      </w:tr>
+      <w:tr>
+        <w:tc>
+          <w:tcPr/>
+          <w:p>
+            <w:pPr>
+              <w:pStyle w:val="Compact"/>
+              <w:jc w:val="left"/>
+            </w:pPr>
+            <w:r>
+              <w:rPr>
+                <w:rStyle w:val="VerbatimChar"/>
+              </w:rPr>
+              <w:t xml:space="preserve">biome-quota.sh.template</w:t>
+            </w:r>
+          </w:p>
+        </w:tc>
+        <w:tc>
+          <w:tcPr/>
+          <w:p>
+            <w:pPr>
+              <w:pStyle w:val="Compact"/>
+              <w:jc w:val="left"/>
+            </w:pPr>
+            <w:r>
+              <w:rPr>
+                <w:rStyle w:val="VerbatimChar"/>
+              </w:rPr>
+              <w:t xml:space="preserve">/usr/local/bin/biome-quota</w:t>
+            </w:r>
+          </w:p>
+        </w:tc>
+        <w:tc>
+          <w:tcPr/>
+          <w:p>
+            <w:pPr>
+              <w:pStyle w:val="Compact"/>
+              <w:jc w:val="left"/>
+            </w:pPr>
+            <w:r>
+              <w:t xml:space="preserve">Researcher ttyd view of personal home quota, file quota and cache age.</w:t>
+            </w:r>
+          </w:p>
+        </w:tc>
+      </w:tr>
+      <w:tr>
+        <w:tc>
+          <w:tcPr/>
+          <w:p>
+            <w:pPr>
+              <w:pStyle w:val="Compact"/>
+              <w:jc w:val="left"/>
+            </w:pPr>
+            <w:r>
+              <w:rPr>
+                <w:rStyle w:val="VerbatimChar"/>
+              </w:rPr>
               <w:t xml:space="preserve">ttyd_login_wrapper.sh</w:t>
             </w:r>
           </w:p>
@@ -28192,8 +28659,8 @@
         </w:pict>
       </w:r>
     </w:p>
-    <w:bookmarkEnd w:id="163"/>
-    <w:bookmarkStart w:id="164" w:name="X97244e911978bef8716840547285d2faeabd63b"/>
+    <w:bookmarkEnd w:id="164"/>
+    <w:bookmarkStart w:id="165" w:name="X97244e911978bef8716840547285d2faeabd63b"/>
     <w:p>
       <w:pPr>
         <w:pStyle w:val="Heading2"/>
@@ -28390,8 +28857,8 @@
         </w:pict>
       </w:r>
     </w:p>
-    <w:bookmarkEnd w:id="164"/>
-    <w:bookmarkStart w:id="168" w:name="reference__script_catalogmd__6-sub-trees"/>
+    <w:bookmarkEnd w:id="165"/>
+    <w:bookmarkStart w:id="169" w:name="reference__script_catalogmd__6-sub-trees"/>
     <w:p>
       <w:pPr>
         <w:pStyle w:val="Heading2"/>
@@ -28400,7 +28867,7 @@
         <w:t xml:space="preserve">6. Sub-trees</w:t>
       </w:r>
     </w:p>
-    <w:bookmarkStart w:id="165" w:name="X2ad1897342ab64edd6a28ed800c3217038c005b"/>
+    <w:bookmarkStart w:id="166" w:name="X2ad1897342ab64edd6a28ed800c3217038c005b"/>
     <w:p>
       <w:pPr>
         <w:pStyle w:val="Heading3"/>
@@ -28447,8 +28914,8 @@
         <w:t xml:space="preserve">modifying the telemetry container behavior.</w:t>
       </w:r>
     </w:p>
-    <w:bookmarkEnd w:id="165"/>
-    <w:bookmarkStart w:id="166" w:name="X738aa369ff17dfda77a0a8e9ec4d60823de72b1"/>
+    <w:bookmarkEnd w:id="166"/>
+    <w:bookmarkStart w:id="167" w:name="X738aa369ff17dfda77a0a8e9ec4d60823de72b1"/>
     <w:p>
       <w:pPr>
         <w:pStyle w:val="Heading3"/>
@@ -28935,8 +29402,8 @@
         </w:tc>
       </w:tr>
     </w:tbl>
-    <w:bookmarkEnd w:id="166"/>
-    <w:bookmarkStart w:id="167" w:name="reference__script_catalogmd__scriptslib"/>
+    <w:bookmarkEnd w:id="167"/>
+    <w:bookmarkStart w:id="168" w:name="reference__script_catalogmd__scriptslib"/>
     <w:p>
       <w:pPr>
         <w:pStyle w:val="Heading3"/>
@@ -29160,9 +29627,9 @@
         </w:pict>
       </w:r>
     </w:p>
-    <w:bookmarkEnd w:id="167"/>
     <w:bookmarkEnd w:id="168"/>
-    <w:bookmarkStart w:id="169" w:name="X70bebd20685078709040ae3f4591d040963a2a3"/>
+    <w:bookmarkEnd w:id="169"/>
+    <w:bookmarkStart w:id="170" w:name="X70bebd20685078709040ae3f4591d040963a2a3"/>
     <w:p>
       <w:pPr>
         <w:pStyle w:val="Heading2"/>
@@ -29399,9 +29866,9 @@
         <w:t xml:space="preserve">docs/reference/SCRIPT_CATALOG.md</w:t>
       </w:r>
     </w:p>
-    <w:bookmarkEnd w:id="169"/>
     <w:bookmarkEnd w:id="170"/>
     <w:bookmarkEnd w:id="171"/>
+    <w:bookmarkEnd w:id="172"/>
     <w:sectPr>
       <w:footerReference r:id="rId9" w:type="default"/>
       <w:pgSz w:h="16838" w:w="11906"/>
@@ -29431,7 +29898,7 @@
         <w:color w:val="666666"/>
         <w:sz w:val="16"/>
       </w:rPr>
-      <w:t xml:space="preserve">BIOME-CALC documentation · version of 2026-10-07</w:t>
+      <w:t xml:space="preserve">BIOME-CALC documentation · version of 2026-10-08</w:t>
     </w:r>
     <w:r>
       <w:rPr>

</xml_diff>